<commit_message>
Update docs and remove deprecated files
</commit_message>
<xml_diff>
--- a/docs/RevOps-Developer-Guide.docx
+++ b/docs/RevOps-Developer-Guide.docx
@@ -4,993 +4,1434 @@
   <w:body>
     <w:p>
       <w:pPr>
-        <w:jc w:val="center"/>
+        <w:pStyle w:val="Title"/>
+        <w:jc w:val="left"/>
       </w:pPr>
       <w:r>
         <w:rPr>
-          <w:rFonts w:ascii="Aptos Display" w:hAnsi="Aptos Display"/>
+          <w:rFonts w:ascii="Aptos" w:hAnsi="Aptos"/>
           <w:b/>
-          <w:color w:val="1F4E79"/>
-          <w:sz w:val="48"/>
+          <w:sz w:val="44"/>
         </w:rPr>
         <w:t>RevOps Dashboard Developer Guide</w:t>
       </w:r>
     </w:p>
     <w:p>
       <w:pPr>
-        <w:jc w:val="center"/>
+        <w:pStyle w:val="Subtitle"/>
       </w:pPr>
       <w:r>
         <w:rPr>
           <w:rFonts w:ascii="Aptos" w:hAnsi="Aptos"/>
           <w:i/>
-          <w:sz w:val="26"/>
+          <w:sz w:val="22"/>
         </w:rPr>
-        <w:t>Architecture, data flow, and maintenance</w:t>
+        <w:t>Architecture, roles, chart data flow, and maintenance notes.</w:t>
       </w:r>
     </w:p>
     <w:p>
       <w:pPr>
-        <w:jc w:val="center"/>
+        <w:pStyle w:val="Heading1"/>
       </w:pPr>
       <w:r>
         <w:rPr>
-          <w:color w:val="606060"/>
-          <w:sz w:val="21"/>
+          <w:rFonts w:ascii="Aptos" w:hAnsi="Aptos"/>
+          <w:b/>
+          <w:sz w:val="32"/>
         </w:rPr>
-        <w:t>Prepared from the project documentation in the RevOps Dashboard repository.</w:t>
-      </w:r>
-    </w:p>
-    <w:p/>
-    <w:p>
-      <w:pPr>
-        <w:pStyle w:val="Heading1"/>
-      </w:pPr>
-      <w:r>
-        <w:t>Developer Guide</w:t>
-      </w:r>
-    </w:p>
-    <w:p>
-      <w:pPr>
-        <w:pStyle w:val="Heading2"/>
-      </w:pPr>
-      <w:r>
         <w:t>Stack</w:t>
       </w:r>
     </w:p>
     <w:p>
       <w:pPr>
         <w:pStyle w:val="ListBullet"/>
-        <w:spacing w:after="60"/>
       </w:pPr>
       <w:r>
+        <w:rPr>
+          <w:rFonts w:ascii="Aptos" w:hAnsi="Aptos"/>
+          <w:sz w:val="22"/>
+        </w:rPr>
         <w:t>Next.js 16 App Router</w:t>
       </w:r>
     </w:p>
     <w:p>
       <w:pPr>
         <w:pStyle w:val="ListBullet"/>
-        <w:spacing w:after="60"/>
       </w:pPr>
       <w:r>
+        <w:rPr>
+          <w:rFonts w:ascii="Aptos" w:hAnsi="Aptos"/>
+          <w:sz w:val="22"/>
+        </w:rPr>
         <w:t>React 19</w:t>
       </w:r>
     </w:p>
     <w:p>
       <w:pPr>
         <w:pStyle w:val="ListBullet"/>
-        <w:spacing w:after="60"/>
       </w:pPr>
       <w:r>
+        <w:rPr>
+          <w:rFonts w:ascii="Aptos" w:hAnsi="Aptos"/>
+          <w:sz w:val="22"/>
+        </w:rPr>
         <w:t>shadcn/ui with Base UI primitives</w:t>
       </w:r>
     </w:p>
     <w:p>
       <w:pPr>
         <w:pStyle w:val="ListBullet"/>
-        <w:spacing w:after="60"/>
       </w:pPr>
       <w:r>
+        <w:rPr>
+          <w:rFonts w:ascii="Aptos" w:hAnsi="Aptos"/>
+          <w:sz w:val="22"/>
+        </w:rPr>
         <w:t>Recharts for charts</w:t>
       </w:r>
     </w:p>
     <w:p>
       <w:pPr>
         <w:pStyle w:val="ListBullet"/>
-        <w:spacing w:after="60"/>
       </w:pPr>
       <w:r>
+        <w:rPr>
+          <w:rFonts w:ascii="Aptos" w:hAnsi="Aptos"/>
+          <w:sz w:val="22"/>
+        </w:rPr>
         <w:t>SQLite via better-sqlite3</w:t>
       </w:r>
     </w:p>
     <w:p>
       <w:pPr>
         <w:pStyle w:val="ListBullet"/>
-        <w:spacing w:after="60"/>
       </w:pPr>
       <w:r>
+        <w:rPr>
+          <w:rFonts w:ascii="Aptos" w:hAnsi="Aptos"/>
+          <w:sz w:val="22"/>
+        </w:rPr>
         <w:t>Vitest for tests</w:t>
       </w:r>
     </w:p>
     <w:p>
-      <w:pPr>
-        <w:spacing w:after="160" w:line="276" w:lineRule="auto"/>
-      </w:pPr>
+      <w:pPr/>
       <w:r>
+        <w:rPr>
+          <w:rFonts w:ascii="Aptos" w:hAnsi="Aptos"/>
+          <w:sz w:val="22"/>
+        </w:rPr>
         <w:t>Before changing framework behavior, read the relevant local Next.js docs in node_modules/next/dist/docs/.</w:t>
       </w:r>
     </w:p>
     <w:p>
       <w:pPr>
-        <w:pStyle w:val="Heading2"/>
+        <w:pStyle w:val="Heading1"/>
       </w:pPr>
       <w:r>
-        <w:t>High-level architecture</w:t>
+        <w:rPr>
+          <w:rFonts w:ascii="Aptos" w:hAnsi="Aptos"/>
+          <w:b/>
+          <w:sz w:val="32"/>
+        </w:rPr>
+        <w:t>Roles And Access</w:t>
       </w:r>
     </w:p>
     <w:p>
       <w:pPr>
-        <w:pStyle w:val="Heading3"/>
+        <w:pStyle w:val="Heading2"/>
       </w:pPr>
       <w:r>
+        <w:rPr>
+          <w:rFonts w:ascii="Aptos" w:hAnsi="Aptos"/>
+          <w:b/>
+          <w:sz w:val="26"/>
+        </w:rPr>
+        <w:t>Standard user behavior</w:t>
+      </w:r>
+    </w:p>
+    <w:p>
+      <w:pPr>
+        <w:pStyle w:val="ListBullet"/>
+      </w:pPr>
+      <w:r>
+        <w:rPr>
+          <w:rFonts w:ascii="Aptos" w:hAnsi="Aptos"/>
+          <w:sz w:val="22"/>
+        </w:rPr>
+        <w:t>Can sign in, view the dashboard, switch tabs, save weekly snapshots, and use exports.</w:t>
+      </w:r>
+    </w:p>
+    <w:p>
+      <w:pPr>
+        <w:pStyle w:val="ListBullet"/>
+      </w:pPr>
+      <w:r>
+        <w:rPr>
+          <w:rFonts w:ascii="Aptos" w:hAnsi="Aptos"/>
+          <w:sz w:val="22"/>
+        </w:rPr>
+        <w:t>Does not see the Admin Panel entry or admin account-management actions.</w:t>
+      </w:r>
+    </w:p>
+    <w:p>
+      <w:pPr>
+        <w:pStyle w:val="Heading2"/>
+      </w:pPr>
+      <w:r>
+        <w:rPr>
+          <w:rFonts w:ascii="Aptos" w:hAnsi="Aptos"/>
+          <w:b/>
+          <w:sz w:val="26"/>
+        </w:rPr>
+        <w:t>Admin behavior</w:t>
+      </w:r>
+    </w:p>
+    <w:p>
+      <w:pPr>
+        <w:pStyle w:val="ListBullet"/>
+      </w:pPr>
+      <w:r>
+        <w:rPr>
+          <w:rFonts w:ascii="Aptos" w:hAnsi="Aptos"/>
+          <w:sz w:val="22"/>
+        </w:rPr>
+        <w:t>Gets the same dashboard access as a standard user.</w:t>
+      </w:r>
+    </w:p>
+    <w:p>
+      <w:pPr>
+        <w:pStyle w:val="ListBullet"/>
+      </w:pPr>
+      <w:r>
+        <w:rPr>
+          <w:rFonts w:ascii="Aptos" w:hAnsi="Aptos"/>
+          <w:sz w:val="22"/>
+        </w:rPr>
+        <w:t>Also gets Admin Panel access inside the dashboard workspace and through /admin.</w:t>
+      </w:r>
+    </w:p>
+    <w:p>
+      <w:pPr>
+        <w:pStyle w:val="ListBullet"/>
+      </w:pPr>
+      <w:r>
+        <w:rPr>
+          <w:rFonts w:ascii="Aptos" w:hAnsi="Aptos"/>
+          <w:sz w:val="22"/>
+        </w:rPr>
+        <w:t>Can create users, edit roles and display names, reset passwords, and delete users.</w:t>
+      </w:r>
+    </w:p>
+    <w:p>
+      <w:pPr>
+        <w:pStyle w:val="ListBullet"/>
+      </w:pPr>
+      <w:r>
+        <w:rPr>
+          <w:rFonts w:ascii="Aptos" w:hAnsi="Aptos"/>
+          <w:sz w:val="22"/>
+        </w:rPr>
+        <w:t>Final admin safety checks live in the server-side account management flow and must stay intact.</w:t>
+      </w:r>
+    </w:p>
+    <w:p>
+      <w:pPr>
+        <w:pStyle w:val="Heading1"/>
+      </w:pPr>
+      <w:r>
+        <w:rPr>
+          <w:rFonts w:ascii="Aptos" w:hAnsi="Aptos"/>
+          <w:b/>
+          <w:sz w:val="32"/>
+        </w:rPr>
+        <w:t>High-Level Architecture</w:t>
+      </w:r>
+    </w:p>
+    <w:p>
+      <w:pPr>
+        <w:pStyle w:val="Heading2"/>
+      </w:pPr>
+      <w:r>
+        <w:rPr>
+          <w:rFonts w:ascii="Aptos" w:hAnsi="Aptos"/>
+          <w:b/>
+          <w:sz w:val="26"/>
+        </w:rPr>
         <w:t>App routes</w:t>
       </w:r>
     </w:p>
     <w:p>
       <w:pPr>
         <w:pStyle w:val="ListBullet"/>
-        <w:spacing w:after="60"/>
       </w:pPr>
       <w:r>
-        <w:t>app/dashboard/page.tsx</w:t>
+        <w:rPr>
+          <w:rFonts w:ascii="Aptos" w:hAnsi="Aptos"/>
+          <w:sz w:val="22"/>
+        </w:rPr>
+        <w:t>app/dashboard/page.tsx: Server component that loads snapshots, dashboard data, forecast data, and admin users when the current session is admin.</w:t>
       </w:r>
     </w:p>
     <w:p>
       <w:pPr>
-        <w:spacing w:after="160" w:line="276" w:lineRule="auto"/>
+        <w:pStyle w:val="ListBullet"/>
       </w:pPr>
       <w:r>
-        <w:t>- Server component that loads snapshots, dashboard data, and forecast data.</w:t>
+        <w:rPr>
+          <w:rFonts w:ascii="Aptos" w:hAnsi="Aptos"/>
+          <w:sz w:val="22"/>
+        </w:rPr>
+        <w:t>app/admin/page.tsx: Direct admin route for account management. The same admin panel is also rendered inside /dashboard as an admin-only workspace view.</w:t>
       </w:r>
     </w:p>
     <w:p>
       <w:pPr>
         <w:pStyle w:val="ListBullet"/>
-        <w:spacing w:after="60"/>
       </w:pPr>
       <w:r>
-        <w:t>app/api/weekly-snapshots/route.ts</w:t>
+        <w:rPr>
+          <w:rFonts w:ascii="Aptos" w:hAnsi="Aptos"/>
+          <w:sz w:val="22"/>
+        </w:rPr>
+        <w:t>app/admin/actions.ts: Server actions for creating users, changing roles and names, resetting passwords, and deleting users.</w:t>
       </w:r>
     </w:p>
     <w:p>
       <w:pPr>
-        <w:spacing w:after="160" w:line="276" w:lineRule="auto"/>
+        <w:pStyle w:val="ListBullet"/>
       </w:pPr>
       <w:r>
-        <w:t>- GET returns the timeline, dashboard summary, and forecast. - POST validates a snapshot payload and stores a new revision.</w:t>
+        <w:rPr>
+          <w:rFonts w:ascii="Aptos" w:hAnsi="Aptos"/>
+          <w:sz w:val="22"/>
+        </w:rPr>
+        <w:t>app/api/weekly-snapshots/route.ts: GET returns timeline, dashboard summary, and forecast. POST validates a snapshot payload and stores a new revision.</w:t>
       </w:r>
     </w:p>
     <w:p>
       <w:pPr>
         <w:pStyle w:val="ListBullet"/>
-        <w:spacing w:after="60"/>
       </w:pPr>
       <w:r>
-        <w:t>app/api/weekly-snapshots/[weekOf]/revisions/route.ts</w:t>
+        <w:rPr>
+          <w:rFonts w:ascii="Aptos" w:hAnsi="Aptos"/>
+          <w:sz w:val="22"/>
+        </w:rPr>
+        <w:t>app/api/weekly-snapshots/[weekOf]/revisions/route.ts: Returns revision history for a saved week.</w:t>
       </w:r>
     </w:p>
     <w:p>
       <w:pPr>
-        <w:spacing w:after="160" w:line="276" w:lineRule="auto"/>
+        <w:pStyle w:val="ListBullet"/>
       </w:pPr>
       <w:r>
-        <w:t>- Returns revision history for a saved week.</w:t>
+        <w:rPr>
+          <w:rFonts w:ascii="Aptos" w:hAnsi="Aptos"/>
+          <w:sz w:val="22"/>
+        </w:rPr>
+        <w:t>app/api/export/weekly-snapshots/route.ts: Builds and downloads the Excel workbook.</w:t>
       </w:r>
     </w:p>
     <w:p>
       <w:pPr>
-        <w:pStyle w:val="ListBullet"/>
-        <w:spacing w:after="60"/>
+        <w:pStyle w:val="Heading2"/>
       </w:pPr>
       <w:r>
-        <w:t>app/api/export/weekly-snapshots/route.ts</w:t>
-      </w:r>
-    </w:p>
-    <w:p>
-      <w:pPr>
-        <w:spacing w:after="160" w:line="276" w:lineRule="auto"/>
-      </w:pPr>
-      <w:r>
-        <w:t>- Builds and downloads the Excel workbook.</w:t>
-      </w:r>
-    </w:p>
-    <w:p>
-      <w:pPr>
-        <w:pStyle w:val="Heading3"/>
-      </w:pPr>
-      <w:r>
+        <w:rPr>
+          <w:rFonts w:ascii="Aptos" w:hAnsi="Aptos"/>
+          <w:b/>
+          <w:sz w:val="26"/>
+        </w:rPr>
         <w:t>Core libraries</w:t>
       </w:r>
     </w:p>
     <w:p>
       <w:pPr>
         <w:pStyle w:val="ListBullet"/>
-        <w:spacing w:after="60"/>
       </w:pPr>
       <w:r>
-        <w:t>lib/kpi-dashboard.ts</w:t>
+        <w:rPr>
+          <w:rFonts w:ascii="Aptos" w:hAnsi="Aptos"/>
+          <w:sz w:val="22"/>
+        </w:rPr>
+        <w:t>lib/kpi-dashboard.ts: Source of truth for metric metadata, snapshot schemas, formatting helpers, and dashboard summary builders.</w:t>
       </w:r>
     </w:p>
     <w:p>
       <w:pPr>
-        <w:spacing w:after="160" w:line="276" w:lineRule="auto"/>
+        <w:pStyle w:val="ListBullet"/>
       </w:pPr>
       <w:r>
-        <w:t>- Source of truth for metric metadata, snapshot schemas, formatting helpers, and dashboard summary builders.</w:t>
+        <w:rPr>
+          <w:rFonts w:ascii="Aptos" w:hAnsi="Aptos"/>
+          <w:sz w:val="22"/>
+        </w:rPr>
+        <w:t>lib/dashboard-forecast.ts: Produces directional +7d and +30d projections from saved weekly history.</w:t>
       </w:r>
     </w:p>
     <w:p>
       <w:pPr>
         <w:pStyle w:val="ListBullet"/>
-        <w:spacing w:after="60"/>
       </w:pPr>
       <w:r>
-        <w:t>lib/dashboard-forecast.ts</w:t>
+        <w:rPr>
+          <w:rFonts w:ascii="Aptos" w:hAnsi="Aptos"/>
+          <w:sz w:val="22"/>
+        </w:rPr>
+        <w:t>lib/dashboard-db.ts: Owns SQLite schema creation, migration from legacy JSON, and revision persistence.</w:t>
       </w:r>
     </w:p>
     <w:p>
       <w:pPr>
-        <w:spacing w:after="160" w:line="276" w:lineRule="auto"/>
+        <w:pStyle w:val="ListBullet"/>
       </w:pPr>
       <w:r>
-        <w:t>- Produces directional +7d and +30d projections from the latest saved weekly history.</w:t>
+        <w:rPr>
+          <w:rFonts w:ascii="Aptos" w:hAnsi="Aptos"/>
+          <w:sz w:val="22"/>
+        </w:rPr>
+        <w:t>lib/dashboard-store.ts: Thin server-only adapter around the DB layer.</w:t>
       </w:r>
     </w:p>
     <w:p>
       <w:pPr>
         <w:pStyle w:val="ListBullet"/>
-        <w:spacing w:after="60"/>
       </w:pPr>
       <w:r>
-        <w:t>lib/dashboard-db.ts</w:t>
+        <w:rPr>
+          <w:rFonts w:ascii="Aptos" w:hAnsi="Aptos"/>
+          <w:sz w:val="22"/>
+        </w:rPr>
+        <w:t>lib/auth.ts: Resolves the session cookie against the local user store.</w:t>
       </w:r>
     </w:p>
     <w:p>
       <w:pPr>
-        <w:spacing w:after="160" w:line="276" w:lineRule="auto"/>
+        <w:pStyle w:val="ListBullet"/>
       </w:pPr>
       <w:r>
-        <w:t>- Owns SQLite schema creation, migration from legacy JSON, and revision persistence.</w:t>
+        <w:rPr>
+          <w:rFonts w:ascii="Aptos" w:hAnsi="Aptos"/>
+          <w:sz w:val="22"/>
+        </w:rPr>
+        <w:t>lib/user-store.ts: JSON-backed account store, password hashing, and admin-account safety checks.</w:t>
       </w:r>
     </w:p>
     <w:p>
       <w:pPr>
         <w:pStyle w:val="ListBullet"/>
-        <w:spacing w:after="60"/>
       </w:pPr>
       <w:r>
-        <w:t>lib/dashboard-store.ts</w:t>
+        <w:rPr>
+          <w:rFonts w:ascii="Aptos" w:hAnsi="Aptos"/>
+          <w:sz w:val="22"/>
+        </w:rPr>
+        <w:t>lib/export-weekly-dashboard.ts: Excel export builder.</w:t>
       </w:r>
     </w:p>
     <w:p>
       <w:pPr>
-        <w:spacing w:after="160" w:line="276" w:lineRule="auto"/>
+        <w:pStyle w:val="ListBullet"/>
       </w:pPr>
       <w:r>
-        <w:t>- Thin server-only adapter around the DB layer.</w:t>
+        <w:rPr>
+          <w:rFonts w:ascii="Aptos" w:hAnsi="Aptos"/>
+          <w:sz w:val="22"/>
+        </w:rPr>
+        <w:t>lib/weekly-snapshot-csv.ts: CSV parsing and template generation helpers.</w:t>
       </w:r>
     </w:p>
     <w:p>
       <w:pPr>
-        <w:pStyle w:val="ListBullet"/>
-        <w:spacing w:after="60"/>
+        <w:pStyle w:val="Heading2"/>
       </w:pPr>
       <w:r>
-        <w:t>lib/export-weekly-dashboard.ts</w:t>
-      </w:r>
-    </w:p>
-    <w:p>
-      <w:pPr>
-        <w:spacing w:after="160" w:line="276" w:lineRule="auto"/>
-      </w:pPr>
-      <w:r>
-        <w:t>- Excel export builder.</w:t>
-      </w:r>
-    </w:p>
-    <w:p>
-      <w:pPr>
-        <w:pStyle w:val="ListBullet"/>
-        <w:spacing w:after="60"/>
-      </w:pPr>
-      <w:r>
-        <w:t>lib/weekly-snapshot-csv.ts</w:t>
-      </w:r>
-    </w:p>
-    <w:p>
-      <w:pPr>
-        <w:spacing w:after="160" w:line="276" w:lineRule="auto"/>
-      </w:pPr>
-      <w:r>
-        <w:t>- CSV parsing and template generation helpers.</w:t>
-      </w:r>
-    </w:p>
-    <w:p>
-      <w:pPr>
-        <w:pStyle w:val="Heading3"/>
-      </w:pPr>
-      <w:r>
+        <w:rPr>
+          <w:rFonts w:ascii="Aptos" w:hAnsi="Aptos"/>
+          <w:b/>
+          <w:sz w:val="26"/>
+        </w:rPr>
         <w:t>Main UI files</w:t>
       </w:r>
     </w:p>
     <w:p>
       <w:pPr>
         <w:pStyle w:val="ListBullet"/>
-        <w:spacing w:after="60"/>
       </w:pPr>
       <w:r>
-        <w:t>components/dashboard-workspace.tsx</w:t>
+        <w:rPr>
+          <w:rFonts w:ascii="Aptos" w:hAnsi="Aptos"/>
+          <w:sz w:val="22"/>
+        </w:rPr>
+        <w:t>components/dashboard-workspace.tsx: Dashboard tabs, charts, tables, range controls, forecast card, and admin workspace view.</w:t>
       </w:r>
     </w:p>
     <w:p>
       <w:pPr>
-        <w:spacing w:after="160" w:line="276" w:lineRule="auto"/>
+        <w:pStyle w:val="ListBullet"/>
       </w:pPr>
       <w:r>
-        <w:t>- Dashboard tabs, charts, tables, range controls, and the forecast card.</w:t>
+        <w:rPr>
+          <w:rFonts w:ascii="Aptos" w:hAnsi="Aptos"/>
+          <w:sz w:val="22"/>
+        </w:rPr>
+        <w:t>components/app-sidebar.tsx: Left navigation and admin-only workspace entry.</w:t>
       </w:r>
     </w:p>
     <w:p>
       <w:pPr>
         <w:pStyle w:val="ListBullet"/>
-        <w:spacing w:after="60"/>
       </w:pPr>
       <w:r>
-        <w:t>components/weekly-update-form.tsx</w:t>
+        <w:rPr>
+          <w:rFonts w:ascii="Aptos" w:hAnsi="Aptos"/>
+          <w:sz w:val="22"/>
+        </w:rPr>
+        <w:t>components/weekly-update-form.tsx: Weekly snapshot form, validation UX, and derived field preview for pipeline velocity.</w:t>
       </w:r>
     </w:p>
     <w:p>
       <w:pPr>
-        <w:spacing w:after="160" w:line="276" w:lineRule="auto"/>
+        <w:pStyle w:val="Heading1"/>
       </w:pPr>
       <w:r>
-        <w:t>- Weekly snapshot form, validation UX, and derived field preview for pipeline velocity.</w:t>
+        <w:rPr>
+          <w:rFonts w:ascii="Aptos" w:hAnsi="Aptos"/>
+          <w:b/>
+          <w:sz w:val="32"/>
+        </w:rPr>
+        <w:t>How Chart Updates Work</w:t>
       </w:r>
     </w:p>
     <w:p>
-      <w:pPr>
-        <w:pStyle w:val="Heading2"/>
-      </w:pPr>
+      <w:pPr/>
       <w:r>
-        <w:t>Data model</w:t>
+        <w:rPr>
+          <w:rFonts w:ascii="Aptos" w:hAnsi="Aptos"/>
+          <w:sz w:val="22"/>
+        </w:rPr>
+        <w:t>Use this sequence when you need to explain or debug why a chart changed or did not change.</w:t>
       </w:r>
     </w:p>
     <w:p>
       <w:pPr>
-        <w:spacing w:after="160" w:line="276" w:lineRule="auto"/>
+        <w:pStyle w:val="ListBullet"/>
       </w:pPr>
       <w:r>
-        <w:t>The database stores one logical snapshot per workspace_id + week_of, but each save creates a revision.</w:t>
+        <w:rPr>
+          <w:rFonts w:ascii="Aptos" w:hAnsi="Aptos"/>
+          <w:sz w:val="22"/>
+        </w:rPr>
+        <w:t>A user edits values in components/weekly-update-form.tsx.</w:t>
       </w:r>
     </w:p>
     <w:p>
       <w:pPr>
-        <w:pStyle w:val="Heading3"/>
+        <w:pStyle w:val="ListBullet"/>
       </w:pPr>
       <w:r>
-        <w:t>Tables</w:t>
+        <w:rPr>
+          <w:rFonts w:ascii="Aptos" w:hAnsi="Aptos"/>
+          <w:sz w:val="22"/>
+        </w:rPr>
+        <w:t>The form submits a snapshot payload to app/api/weekly-snapshots/route.ts.</w:t>
       </w:r>
     </w:p>
     <w:p>
       <w:pPr>
         <w:pStyle w:val="ListBullet"/>
-        <w:spacing w:after="60"/>
       </w:pPr>
       <w:r>
+        <w:rPr>
+          <w:rFonts w:ascii="Aptos" w:hAnsi="Aptos"/>
+          <w:sz w:val="22"/>
+        </w:rPr>
+        <w:t>The server validates and normalizes the payload, including derived values such as pipelineVelocity.</w:t>
+      </w:r>
+    </w:p>
+    <w:p>
+      <w:pPr>
+        <w:pStyle w:val="ListBullet"/>
+      </w:pPr>
+      <w:r>
+        <w:rPr>
+          <w:rFonts w:ascii="Aptos" w:hAnsi="Aptos"/>
+          <w:sz w:val="22"/>
+        </w:rPr>
+        <w:t>lib/dashboard-db.ts persists the snapshot and creates a revision when the same weekOf already exists.</w:t>
+      </w:r>
+    </w:p>
+    <w:p>
+      <w:pPr>
+        <w:pStyle w:val="ListBullet"/>
+      </w:pPr>
+      <w:r>
+        <w:rPr>
+          <w:rFonts w:ascii="Aptos" w:hAnsi="Aptos"/>
+          <w:sz w:val="22"/>
+        </w:rPr>
+        <w:t>Dashboard reads then return the latest revision for each week, so charts always show the newest saved version of that Friday.</w:t>
+      </w:r>
+    </w:p>
+    <w:p>
+      <w:pPr>
+        <w:pStyle w:val="ListBullet"/>
+      </w:pPr>
+      <w:r>
+        <w:rPr>
+          <w:rFonts w:ascii="Aptos" w:hAnsi="Aptos"/>
+          <w:sz w:val="22"/>
+        </w:rPr>
+        <w:t>components/dashboard-workspace.tsx renders charts from saved data returned by the dashboard load path, not from temporary client-only form state.</w:t>
+      </w:r>
+    </w:p>
+    <w:p>
+      <w:pPr>
+        <w:pStyle w:val="Heading1"/>
+      </w:pPr>
+      <w:r>
+        <w:rPr>
+          <w:rFonts w:ascii="Aptos" w:hAnsi="Aptos"/>
+          <w:b/>
+          <w:sz w:val="32"/>
+        </w:rPr>
+        <w:t>If You Need To Change A Chart</w:t>
+      </w:r>
+    </w:p>
+    <w:p>
+      <w:pPr>
+        <w:pStyle w:val="Heading2"/>
+      </w:pPr>
+      <w:r>
+        <w:rPr>
+          <w:rFonts w:ascii="Aptos" w:hAnsi="Aptos"/>
+          <w:b/>
+          <w:sz w:val="26"/>
+        </w:rPr>
+        <w:t>Visual-only chart change</w:t>
+      </w:r>
+    </w:p>
+    <w:p>
+      <w:pPr>
+        <w:pStyle w:val="ListBullet"/>
+      </w:pPr>
+      <w:r>
+        <w:rPr>
+          <w:rFonts w:ascii="Aptos" w:hAnsi="Aptos"/>
+          <w:sz w:val="22"/>
+        </w:rPr>
+        <w:t>Start in components/dashboard-workspace.tsx.</w:t>
+      </w:r>
+    </w:p>
+    <w:p>
+      <w:pPr>
+        <w:pStyle w:val="ListBullet"/>
+      </w:pPr>
+      <w:r>
+        <w:rPr>
+          <w:rFonts w:ascii="Aptos" w:hAnsi="Aptos"/>
+          <w:sz w:val="22"/>
+        </w:rPr>
+        <w:t>Adjust the relevant Recharts component, labels, axis formatting, colors, legends, or card layout.</w:t>
+      </w:r>
+    </w:p>
+    <w:p>
+      <w:pPr>
+        <w:pStyle w:val="ListBullet"/>
+      </w:pPr>
+      <w:r>
+        <w:rPr>
+          <w:rFonts w:ascii="Aptos" w:hAnsi="Aptos"/>
+          <w:sz w:val="22"/>
+        </w:rPr>
+        <w:t>Verify the selected range still works correctly after the UI change.</w:t>
+      </w:r>
+    </w:p>
+    <w:p>
+      <w:pPr>
+        <w:pStyle w:val="Heading2"/>
+      </w:pPr>
+      <w:r>
+        <w:rPr>
+          <w:rFonts w:ascii="Aptos" w:hAnsi="Aptos"/>
+          <w:b/>
+          <w:sz w:val="26"/>
+        </w:rPr>
+        <w:t>Metric or data logic change</w:t>
+      </w:r>
+    </w:p>
+    <w:p>
+      <w:pPr>
+        <w:pStyle w:val="ListBullet"/>
+      </w:pPr>
+      <w:r>
+        <w:rPr>
+          <w:rFonts w:ascii="Aptos" w:hAnsi="Aptos"/>
+          <w:sz w:val="22"/>
+        </w:rPr>
+        <w:t>Start in lib/kpi-dashboard.ts if the metric definition, labels, formatting, bounds, or summary logic changes.</w:t>
+      </w:r>
+    </w:p>
+    <w:p>
+      <w:pPr>
+        <w:pStyle w:val="ListBullet"/>
+      </w:pPr>
+      <w:r>
+        <w:rPr>
+          <w:rFonts w:ascii="Aptos" w:hAnsi="Aptos"/>
+          <w:sz w:val="22"/>
+        </w:rPr>
+        <w:t>Update components/weekly-update-form.tsx if the metric is user-editable.</w:t>
+      </w:r>
+    </w:p>
+    <w:p>
+      <w:pPr>
+        <w:pStyle w:val="ListBullet"/>
+      </w:pPr>
+      <w:r>
+        <w:rPr>
+          <w:rFonts w:ascii="Aptos" w:hAnsi="Aptos"/>
+          <w:sz w:val="22"/>
+        </w:rPr>
+        <w:t>Update lib/dashboard-forecast.ts if the forecast should use new logic for that metric.</w:t>
+      </w:r>
+    </w:p>
+    <w:p>
+      <w:pPr>
+        <w:pStyle w:val="ListBullet"/>
+      </w:pPr>
+      <w:r>
+        <w:rPr>
+          <w:rFonts w:ascii="Aptos" w:hAnsi="Aptos"/>
+          <w:sz w:val="22"/>
+        </w:rPr>
+        <w:t>Check lib/dashboard-db.ts and lib/dashboard-store.ts if persistence or query shape changes are needed.</w:t>
+      </w:r>
+    </w:p>
+    <w:p>
+      <w:pPr>
+        <w:pStyle w:val="ListBullet"/>
+      </w:pPr>
+      <w:r>
+        <w:rPr>
+          <w:rFonts w:ascii="Aptos" w:hAnsi="Aptos"/>
+          <w:sz w:val="22"/>
+        </w:rPr>
+        <w:t>Update tests and both user-facing and developer documentation when behavior changes.</w:t>
+      </w:r>
+    </w:p>
+    <w:p>
+      <w:pPr>
+        <w:pStyle w:val="Heading2"/>
+      </w:pPr>
+      <w:r>
+        <w:rPr>
+          <w:rFonts w:ascii="Aptos" w:hAnsi="Aptos"/>
+          <w:b/>
+          <w:sz w:val="26"/>
+        </w:rPr>
+        <w:t>Quick debug checklist</w:t>
+      </w:r>
+    </w:p>
+    <w:p>
+      <w:pPr>
+        <w:pStyle w:val="ListBullet"/>
+      </w:pPr>
+      <w:r>
+        <w:rPr>
+          <w:rFonts w:ascii="Aptos" w:hAnsi="Aptos"/>
+          <w:sz w:val="22"/>
+        </w:rPr>
+        <w:t>Was the snapshot actually saved?</w:t>
+      </w:r>
+    </w:p>
+    <w:p>
+      <w:pPr>
+        <w:pStyle w:val="ListBullet"/>
+      </w:pPr>
+      <w:r>
+        <w:rPr>
+          <w:rFonts w:ascii="Aptos" w:hAnsi="Aptos"/>
+          <w:sz w:val="22"/>
+        </w:rPr>
+        <w:t>Was the correct Friday weekOf used?</w:t>
+      </w:r>
+    </w:p>
+    <w:p>
+      <w:pPr>
+        <w:pStyle w:val="ListBullet"/>
+      </w:pPr>
+      <w:r>
+        <w:rPr>
+          <w:rFonts w:ascii="Aptos" w:hAnsi="Aptos"/>
+          <w:sz w:val="22"/>
+        </w:rPr>
+        <w:t>Did the save create a new revision for an existing week?</w:t>
+      </w:r>
+    </w:p>
+    <w:p>
+      <w:pPr>
+        <w:pStyle w:val="ListBullet"/>
+      </w:pPr>
+      <w:r>
+        <w:rPr>
+          <w:rFonts w:ascii="Aptos" w:hAnsi="Aptos"/>
+          <w:sz w:val="22"/>
+        </w:rPr>
+        <w:t>Is the selected chart range hiding the updated week?</w:t>
+      </w:r>
+    </w:p>
+    <w:p>
+      <w:pPr>
+        <w:pStyle w:val="ListBullet"/>
+      </w:pPr>
+      <w:r>
+        <w:rPr>
+          <w:rFonts w:ascii="Aptos" w:hAnsi="Aptos"/>
+          <w:sz w:val="22"/>
+        </w:rPr>
+        <w:t>Did a formatter or derived metric change make the value look different without changing the raw saved input?</w:t>
+      </w:r>
+    </w:p>
+    <w:p>
+      <w:pPr>
+        <w:pStyle w:val="Heading1"/>
+      </w:pPr>
+      <w:r>
+        <w:rPr>
+          <w:rFonts w:ascii="Aptos" w:hAnsi="Aptos"/>
+          <w:b/>
+          <w:sz w:val="32"/>
+        </w:rPr>
+        <w:t>Data Model</w:t>
+      </w:r>
+    </w:p>
+    <w:p>
+      <w:pPr/>
+      <w:r>
+        <w:rPr>
+          <w:rFonts w:ascii="Aptos" w:hAnsi="Aptos"/>
+          <w:sz w:val="22"/>
+        </w:rPr>
+        <w:t>The database stores one logical snapshot per workspace_id + week_of, but each save creates a revision. The visible timeline always shows the latest revision for each week.</w:t>
+      </w:r>
+    </w:p>
+    <w:p>
+      <w:pPr>
+        <w:pStyle w:val="ListBullet"/>
+      </w:pPr>
+      <w:r>
+        <w:rPr>
+          <w:rFonts w:ascii="Aptos" w:hAnsi="Aptos"/>
+          <w:sz w:val="22"/>
+        </w:rPr>
         <w:t>workspaces</w:t>
       </w:r>
     </w:p>
     <w:p>
       <w:pPr>
         <w:pStyle w:val="ListBullet"/>
-        <w:spacing w:after="60"/>
       </w:pPr>
       <w:r>
+        <w:rPr>
+          <w:rFonts w:ascii="Aptos" w:hAnsi="Aptos"/>
+          <w:sz w:val="22"/>
+        </w:rPr>
         <w:t>snapshots</w:t>
       </w:r>
     </w:p>
     <w:p>
       <w:pPr>
         <w:pStyle w:val="ListBullet"/>
-        <w:spacing w:after="60"/>
       </w:pPr>
       <w:r>
+        <w:rPr>
+          <w:rFonts w:ascii="Aptos" w:hAnsi="Aptos"/>
+          <w:sz w:val="22"/>
+        </w:rPr>
         <w:t>snapshot_revisions</w:t>
       </w:r>
     </w:p>
     <w:p>
       <w:pPr>
         <w:pStyle w:val="ListBullet"/>
-        <w:spacing w:after="60"/>
       </w:pPr>
       <w:r>
+        <w:rPr>
+          <w:rFonts w:ascii="Aptos" w:hAnsi="Aptos"/>
+          <w:sz w:val="22"/>
+        </w:rPr>
         <w:t>metric_targets</w:t>
       </w:r>
     </w:p>
     <w:p>
       <w:pPr>
         <w:pStyle w:val="ListBullet"/>
-        <w:spacing w:after="60"/>
       </w:pPr>
       <w:r>
+        <w:rPr>
+          <w:rFonts w:ascii="Aptos" w:hAnsi="Aptos"/>
+          <w:sz w:val="22"/>
+        </w:rPr>
         <w:t>alert_subscriptions</w:t>
       </w:r>
     </w:p>
     <w:p>
       <w:pPr>
-        <w:pStyle w:val="Heading3"/>
+        <w:pStyle w:val="Heading1"/>
       </w:pPr>
       <w:r>
-        <w:t>Snapshot behavior</w:t>
+        <w:rPr>
+          <w:rFonts w:ascii="Aptos" w:hAnsi="Aptos"/>
+          <w:b/>
+          <w:sz w:val="32"/>
+        </w:rPr>
+        <w:t>Derived Metric Behavior</w:t>
       </w:r>
     </w:p>
     <w:p>
       <w:pPr>
-        <w:pStyle w:val="ListBullet"/>
-        <w:spacing w:after="60"/>
+        <w:pStyle w:val="Heading2"/>
       </w:pPr>
       <w:r>
-        <w:t>The visible timeline always shows the latest revision for each week.</w:t>
-      </w:r>
-    </w:p>
-    <w:p>
-      <w:pPr>
-        <w:pStyle w:val="ListBullet"/>
-        <w:spacing w:after="60"/>
-      </w:pPr>
-      <w:r>
-        <w:t>Saving an existing weekOf does not destroy prior versions.</w:t>
-      </w:r>
-    </w:p>
-    <w:p>
-      <w:pPr>
-        <w:pStyle w:val="ListBullet"/>
-        <w:spacing w:after="60"/>
-      </w:pPr>
-      <w:r>
-        <w:t>Revision history is available through the revisions API route.</w:t>
-      </w:r>
-    </w:p>
-    <w:p>
-      <w:pPr>
-        <w:pStyle w:val="Heading2"/>
-      </w:pPr>
-      <w:r>
-        <w:t>Derived metric behavior</w:t>
-      </w:r>
-    </w:p>
-    <w:p>
-      <w:pPr>
-        <w:pStyle w:val="Heading3"/>
-      </w:pPr>
-      <w:r>
+        <w:rPr>
+          <w:rFonts w:ascii="Aptos" w:hAnsi="Aptos"/>
+          <w:b/>
+          <w:sz w:val="26"/>
+        </w:rPr>
         <w:t>Pipeline velocity</w:t>
       </w:r>
     </w:p>
     <w:p>
       <w:pPr>
-        <w:spacing w:after="160" w:line="276" w:lineRule="auto"/>
+        <w:pStyle w:val="ListBullet"/>
       </w:pPr>
       <w:r>
-        <w:t>pipelineVelocity is no longer treated as a manually curated field in the form.</w:t>
+        <w:rPr>
+          <w:rFonts w:ascii="Aptos" w:hAnsi="Aptos"/>
+          <w:sz w:val="22"/>
+        </w:rPr>
+        <w:t>pipelineVelocity is not manually curated in the form.</w:t>
       </w:r>
     </w:p>
     <w:p>
       <w:pPr>
-        <w:spacing w:after="160" w:line="276" w:lineRule="auto"/>
+        <w:pStyle w:val="ListBullet"/>
       </w:pPr>
       <w:r>
-        <w:t>How it works:</w:t>
-      </w:r>
-    </w:p>
-    <w:p>
-      <w:pPr>
-        <w:pStyle w:val="ListNumber"/>
-        <w:spacing w:after="60"/>
-      </w:pPr>
-      <w:r>
+        <w:rPr>
+          <w:rFonts w:ascii="Aptos" w:hAnsi="Aptos"/>
+          <w:sz w:val="22"/>
+        </w:rPr>
         <w:t>The form watches pipelineValue, salesCycleDays, and closeRatePct.</w:t>
       </w:r>
     </w:p>
     <w:p>
       <w:pPr>
-        <w:pStyle w:val="ListNumber"/>
-        <w:spacing w:after="60"/>
+        <w:pStyle w:val="ListBullet"/>
       </w:pPr>
       <w:r>
+        <w:rPr>
+          <w:rFonts w:ascii="Aptos" w:hAnsi="Aptos"/>
+          <w:sz w:val="22"/>
+        </w:rPr>
         <w:t>calculatePipelineVelocity() in lib/kpi-dashboard.ts uses saved history to fit a lightweight regression model.</w:t>
       </w:r>
     </w:p>
     <w:p>
       <w:pPr>
-        <w:pStyle w:val="ListNumber"/>
-        <w:spacing w:after="60"/>
+        <w:pStyle w:val="ListBullet"/>
       </w:pPr>
       <w:r>
+        <w:rPr>
+          <w:rFonts w:ascii="Aptos" w:hAnsi="Aptos"/>
+          <w:sz w:val="22"/>
+        </w:rPr>
         <w:t>If there is not enough history for regression, it falls back to a median historical scale factor.</w:t>
       </w:r>
     </w:p>
     <w:p>
       <w:pPr>
-        <w:pStyle w:val="ListNumber"/>
-        <w:spacing w:after="60"/>
+        <w:pStyle w:val="ListBullet"/>
       </w:pPr>
       <w:r>
-        <w:t>The server recalculates pipelineVelocity before persistence, so the saved value stays consistent even if a caller posts a manual number.</w:t>
+        <w:rPr>
+          <w:rFonts w:ascii="Aptos" w:hAnsi="Aptos"/>
+          <w:sz w:val="22"/>
+        </w:rPr>
+        <w:t>The server recalculates pipelineVelocity before persistence so saved data stays consistent.</w:t>
       </w:r>
     </w:p>
     <w:p>
       <w:pPr>
-        <w:spacing w:after="160" w:line="276" w:lineRule="auto"/>
+        <w:pStyle w:val="Heading1"/>
       </w:pPr>
       <w:r>
-        <w:t>Why this exists:</w:t>
+        <w:rPr>
+          <w:rFonts w:ascii="Aptos" w:hAnsi="Aptos"/>
+          <w:b/>
+          <w:sz w:val="32"/>
+        </w:rPr>
+        <w:t>Forecast Behavior</w:t>
       </w:r>
     </w:p>
     <w:p>
-      <w:pPr>
-        <w:pStyle w:val="ListBullet"/>
-        <w:spacing w:after="60"/>
-      </w:pPr>
+      <w:pPr/>
       <w:r>
-        <w:t>It removes a repetitive manual input.</w:t>
+        <w:rPr>
+          <w:rFonts w:ascii="Aptos" w:hAnsi="Aptos"/>
+          <w:sz w:val="22"/>
+        </w:rPr>
+        <w:t>buildDashboardForecast() projects directional estimates for pipelineValue, pipelineVelocity, closeRatePct, customerAcquisitionCost, and feedRetentionPct. It uses the latest 12 saved weekly snapshots, fits a simple linear trend by time index, projects +7d and +30d values, and clamps results to metric bounds from metricFieldMap.</w:t>
       </w:r>
     </w:p>
     <w:p>
       <w:pPr>
-        <w:pStyle w:val="ListBullet"/>
-        <w:spacing w:after="60"/>
+        <w:pStyle w:val="Heading1"/>
       </w:pPr>
       <w:r>
-        <w:t>It keeps new snapshots aligned with the historical pattern already saved in the dashboard.</w:t>
+        <w:rPr>
+          <w:rFonts w:ascii="Aptos" w:hAnsi="Aptos"/>
+          <w:b/>
+          <w:sz w:val="32"/>
+        </w:rPr>
+        <w:t>Local Development</w:t>
       </w:r>
     </w:p>
     <w:p>
       <w:pPr>
-        <w:pStyle w:val="Heading2"/>
+        <w:pStyle w:val="ListBullet"/>
       </w:pPr>
       <w:r>
-        <w:t>Forecast behavior</w:t>
+        <w:rPr>
+          <w:rFonts w:ascii="Aptos" w:hAnsi="Aptos"/>
+          <w:sz w:val="22"/>
+        </w:rPr>
+        <w:t>npm install</w:t>
       </w:r>
     </w:p>
     <w:p>
       <w:pPr>
-        <w:spacing w:after="160" w:line="276" w:lineRule="auto"/>
-      </w:pPr>
-      <w:r>
-        <w:t>buildDashboardForecast() projects a directional estimate for selected metrics:</w:t>
-      </w:r>
-    </w:p>
-    <w:p>
-      <w:pPr>
         <w:pStyle w:val="ListBullet"/>
-        <w:spacing w:after="60"/>
-      </w:pPr>
-      <w:r>
-        <w:t>pipelineValue</w:t>
-      </w:r>
-    </w:p>
-    <w:p>
-      <w:pPr>
-        <w:pStyle w:val="ListBullet"/>
-        <w:spacing w:after="60"/>
-      </w:pPr>
-      <w:r>
-        <w:t>pipelineVelocity</w:t>
-      </w:r>
-    </w:p>
-    <w:p>
-      <w:pPr>
-        <w:pStyle w:val="ListBullet"/>
-        <w:spacing w:after="60"/>
-      </w:pPr>
-      <w:r>
-        <w:t>closeRatePct</w:t>
-      </w:r>
-    </w:p>
-    <w:p>
-      <w:pPr>
-        <w:pStyle w:val="ListBullet"/>
-        <w:spacing w:after="60"/>
-      </w:pPr>
-      <w:r>
-        <w:t>customerAcquisitionCost</w:t>
-      </w:r>
-    </w:p>
-    <w:p>
-      <w:pPr>
-        <w:pStyle w:val="ListBullet"/>
-        <w:spacing w:after="60"/>
-      </w:pPr>
-      <w:r>
-        <w:t>feedRetentionPct</w:t>
-      </w:r>
-    </w:p>
-    <w:p>
-      <w:pPr>
-        <w:spacing w:after="160" w:line="276" w:lineRule="auto"/>
-      </w:pPr>
-      <w:r>
-        <w:t>Implementation details:</w:t>
-      </w:r>
-    </w:p>
-    <w:p>
-      <w:pPr>
-        <w:pStyle w:val="ListBullet"/>
-        <w:spacing w:after="60"/>
-      </w:pPr>
-      <w:r>
-        <w:t>Uses the latest 12 saved weekly snapshots</w:t>
-      </w:r>
-    </w:p>
-    <w:p>
-      <w:pPr>
-        <w:pStyle w:val="ListBullet"/>
-        <w:spacing w:after="60"/>
-      </w:pPr>
-      <w:r>
-        <w:t>Fits a simple linear trend by time index for each metric</w:t>
-      </w:r>
-    </w:p>
-    <w:p>
-      <w:pPr>
-        <w:pStyle w:val="ListBullet"/>
-        <w:spacing w:after="60"/>
-      </w:pPr>
-      <w:r>
-        <w:t>Projects one week ahead (+7d) and roughly 30 days ahead (+30d)</w:t>
-      </w:r>
-    </w:p>
-    <w:p>
-      <w:pPr>
-        <w:pStyle w:val="ListBullet"/>
-        <w:spacing w:after="60"/>
-      </w:pPr>
-      <w:r>
-        <w:t>Clamps values to the metric bounds from metricFieldMap</w:t>
-      </w:r>
-    </w:p>
-    <w:p>
-      <w:pPr>
-        <w:spacing w:after="160" w:line="276" w:lineRule="auto"/>
-      </w:pPr>
-      <w:r>
-        <w:t>This is intentionally lightweight and explainable. It is meant for operational planning, not financial commitment.</w:t>
-      </w:r>
-    </w:p>
-    <w:p>
-      <w:pPr>
-        <w:pStyle w:val="Heading2"/>
-      </w:pPr>
-      <w:r>
-        <w:t>Local development</w:t>
-      </w:r>
-    </w:p>
-    <w:p>
-      <w:pPr>
-        <w:spacing w:after="160" w:line="240" w:lineRule="auto"/>
-        <w:ind w:left="504"/>
       </w:pPr>
       <w:r>
         <w:rPr>
-          <w:rFonts w:ascii="Cascadia Mono" w:hAnsi="Cascadia Mono"/>
-          <w:sz w:val="19"/>
+          <w:rFonts w:ascii="Aptos" w:hAnsi="Aptos"/>
+          <w:sz w:val="22"/>
         </w:rPr>
-        <w:t>npm install</w:t>
-        <w:br/>
         <w:t>npm run dev</w:t>
       </w:r>
     </w:p>
     <w:p>
       <w:pPr>
-        <w:spacing w:after="160" w:line="276" w:lineRule="auto"/>
+        <w:pStyle w:val="ListBullet"/>
       </w:pPr>
       <w:r>
-        <w:t>Open http://localhost:3000/dashboard.</w:t>
+        <w:rPr>
+          <w:rFonts w:ascii="Aptos" w:hAnsi="Aptos"/>
+          <w:sz w:val="22"/>
+        </w:rPr>
+        <w:t>Open http://localhost:3000/dashboard</w:t>
       </w:r>
     </w:p>
     <w:p>
       <w:pPr>
-        <w:pStyle w:val="Heading2"/>
+        <w:pStyle w:val="Heading1"/>
       </w:pPr>
       <w:r>
-        <w:t>Build, lint, test</w:t>
+        <w:rPr>
+          <w:rFonts w:ascii="Aptos" w:hAnsi="Aptos"/>
+          <w:b/>
+          <w:sz w:val="32"/>
+        </w:rPr>
+        <w:t>Build, Lint, Test</w:t>
       </w:r>
     </w:p>
     <w:p>
       <w:pPr>
-        <w:spacing w:after="160" w:line="240" w:lineRule="auto"/>
-        <w:ind w:left="504"/>
+        <w:pStyle w:val="ListBullet"/>
       </w:pPr>
       <w:r>
         <w:rPr>
-          <w:rFonts w:ascii="Cascadia Mono" w:hAnsi="Cascadia Mono"/>
-          <w:sz w:val="19"/>
+          <w:rFonts w:ascii="Aptos" w:hAnsi="Aptos"/>
+          <w:sz w:val="22"/>
         </w:rPr>
         <w:t>npm run lint</w:t>
-        <w:br/>
+      </w:r>
+    </w:p>
+    <w:p>
+      <w:pPr>
+        <w:pStyle w:val="ListBullet"/>
+      </w:pPr>
+      <w:r>
+        <w:rPr>
+          <w:rFonts w:ascii="Aptos" w:hAnsi="Aptos"/>
+          <w:sz w:val="22"/>
+        </w:rPr>
         <w:t>npm run build</w:t>
-        <w:br/>
+      </w:r>
+    </w:p>
+    <w:p>
+      <w:pPr>
+        <w:pStyle w:val="ListBullet"/>
+      </w:pPr>
+      <w:r>
+        <w:rPr>
+          <w:rFonts w:ascii="Aptos" w:hAnsi="Aptos"/>
+          <w:sz w:val="22"/>
+        </w:rPr>
         <w:t>npm run test</w:t>
       </w:r>
     </w:p>
     <w:p>
       <w:pPr>
-        <w:pStyle w:val="Heading2"/>
+        <w:pStyle w:val="Heading1"/>
       </w:pPr>
       <w:r>
-        <w:t>Data files and environment overrides</w:t>
+        <w:rPr>
+          <w:rFonts w:ascii="Aptos" w:hAnsi="Aptos"/>
+          <w:b/>
+          <w:sz w:val="32"/>
+        </w:rPr>
+        <w:t>Data Files And Environment Overrides</w:t>
       </w:r>
     </w:p>
     <w:p>
       <w:pPr>
-        <w:spacing w:after="160" w:line="276" w:lineRule="auto"/>
+        <w:pStyle w:val="ListBullet"/>
       </w:pPr>
       <w:r>
-        <w:t>Default files:</w:t>
-      </w:r>
-    </w:p>
-    <w:p>
-      <w:pPr>
-        <w:pStyle w:val="ListBullet"/>
-        <w:spacing w:after="60"/>
-      </w:pPr>
-      <w:r>
+        <w:rPr>
+          <w:rFonts w:ascii="Aptos" w:hAnsi="Aptos"/>
+          <w:sz w:val="22"/>
+        </w:rPr>
         <w:t>SQLite DB: data/revops-dashboard.db</w:t>
       </w:r>
     </w:p>
     <w:p>
       <w:pPr>
         <w:pStyle w:val="ListBullet"/>
-        <w:spacing w:after="60"/>
       </w:pPr>
       <w:r>
+        <w:rPr>
+          <w:rFonts w:ascii="Aptos" w:hAnsi="Aptos"/>
+          <w:sz w:val="22"/>
+        </w:rPr>
+        <w:t>Local users: data/users.json</w:t>
+      </w:r>
+    </w:p>
+    <w:p>
+      <w:pPr>
+        <w:pStyle w:val="ListBullet"/>
+      </w:pPr>
+      <w:r>
+        <w:rPr>
+          <w:rFonts w:ascii="Aptos" w:hAnsi="Aptos"/>
+          <w:sz w:val="22"/>
+        </w:rPr>
         <w:t>Legacy JSON seed: data/weekly-metrics.json</w:t>
       </w:r>
     </w:p>
     <w:p>
       <w:pPr>
-        <w:spacing w:after="160" w:line="276" w:lineRule="auto"/>
+        <w:pStyle w:val="ListBullet"/>
       </w:pPr>
       <w:r>
-        <w:t>Optional overrides:</w:t>
+        <w:rPr>
+          <w:rFonts w:ascii="Aptos" w:hAnsi="Aptos"/>
+          <w:sz w:val="22"/>
+        </w:rPr>
+        <w:t>Optional override: REVOPS_DASHBOARD_DB_PATH=/custom/path/revops-dashboard.db</w:t>
       </w:r>
     </w:p>
     <w:p>
       <w:pPr>
-        <w:spacing w:after="160" w:line="240" w:lineRule="auto"/>
-        <w:ind w:left="504"/>
+        <w:pStyle w:val="ListBullet"/>
       </w:pPr>
       <w:r>
         <w:rPr>
-          <w:rFonts w:ascii="Cascadia Mono" w:hAnsi="Cascadia Mono"/>
-          <w:sz w:val="19"/>
+          <w:rFonts w:ascii="Aptos" w:hAnsi="Aptos"/>
+          <w:sz w:val="22"/>
         </w:rPr>
-        <w:t>REVOPS_DASHBOARD_DB_PATH=/custom/path/revops-dashboard.db</w:t>
-        <w:br/>
-        <w:t>REVOPS_LEGACY_SNAPSHOT_PATH=/custom/path/weekly-metrics.json</w:t>
+        <w:t>Optional override: REVOPS_LEGACY_SNAPSHOT_PATH=/custom/path/weekly-metrics.json</w:t>
       </w:r>
     </w:p>
     <w:p>
-      <w:pPr>
-        <w:spacing w:after="160" w:line="276" w:lineRule="auto"/>
-      </w:pPr>
+      <w:pPr/>
       <w:r>
-        <w:t>The tests use these environment variables to isolate temporary databases.</w:t>
+        <w:rPr>
+          <w:rFonts w:ascii="Aptos" w:hAnsi="Aptos"/>
+          <w:sz w:val="22"/>
+        </w:rPr>
+        <w:t>Local user passwords are stored as bcrypt hashes, not plaintext. Tests use the environment overrides to isolate temporary databases.</w:t>
       </w:r>
     </w:p>
     <w:p>
       <w:pPr>
-        <w:pStyle w:val="Heading2"/>
+        <w:pStyle w:val="Heading1"/>
       </w:pPr>
       <w:r>
-        <w:t>Common maintenance tasks</w:t>
+        <w:rPr>
+          <w:rFonts w:ascii="Aptos" w:hAnsi="Aptos"/>
+          <w:b/>
+          <w:sz w:val="32"/>
+        </w:rPr>
+        <w:t>Common Maintenance Tasks</w:t>
       </w:r>
     </w:p>
     <w:p>
       <w:pPr>
-        <w:pStyle w:val="Heading3"/>
+        <w:pStyle w:val="Heading2"/>
       </w:pPr>
       <w:r>
+        <w:rPr>
+          <w:rFonts w:ascii="Aptos" w:hAnsi="Aptos"/>
+          <w:b/>
+          <w:sz w:val="26"/>
+        </w:rPr>
         <w:t>Add or change a metric</w:t>
       </w:r>
     </w:p>
     <w:p>
       <w:pPr>
-        <w:pStyle w:val="ListNumber"/>
-        <w:spacing w:after="60"/>
+        <w:pStyle w:val="ListBullet"/>
       </w:pPr>
       <w:r>
+        <w:rPr>
+          <w:rFonts w:ascii="Aptos" w:hAnsi="Aptos"/>
+          <w:sz w:val="22"/>
+        </w:rPr>
         <w:t>Update the metric schema and metadata in lib/kpi-dashboard.ts.</w:t>
       </w:r>
     </w:p>
     <w:p>
       <w:pPr>
-        <w:pStyle w:val="ListNumber"/>
-        <w:spacing w:after="60"/>
+        <w:pStyle w:val="ListBullet"/>
       </w:pPr>
       <w:r>
-        <w:t>Update any chart or card usage in components/dashboard-workspace.tsx.</w:t>
+        <w:rPr>
+          <w:rFonts w:ascii="Aptos" w:hAnsi="Aptos"/>
+          <w:sz w:val="22"/>
+        </w:rPr>
+        <w:t>Update chart or card usage in components/dashboard-workspace.tsx.</w:t>
       </w:r>
     </w:p>
     <w:p>
       <w:pPr>
-        <w:pStyle w:val="ListNumber"/>
-        <w:spacing w:after="60"/>
+        <w:pStyle w:val="ListBullet"/>
       </w:pPr>
       <w:r>
-        <w:t>Update the weekly form in components/weekly-update-form.tsx if the metric is editable.</w:t>
+        <w:rPr>
+          <w:rFonts w:ascii="Aptos" w:hAnsi="Aptos"/>
+          <w:sz w:val="22"/>
+        </w:rPr>
+        <w:t>Update components/weekly-update-form.tsx if the metric is editable.</w:t>
       </w:r>
     </w:p>
     <w:p>
       <w:pPr>
-        <w:pStyle w:val="ListNumber"/>
-        <w:spacing w:after="60"/>
+        <w:pStyle w:val="ListBullet"/>
       </w:pPr>
       <w:r>
+        <w:rPr>
+          <w:rFonts w:ascii="Aptos" w:hAnsi="Aptos"/>
+          <w:sz w:val="22"/>
+        </w:rPr>
         <w:t>Update tests and docs.</w:t>
       </w:r>
     </w:p>
     <w:p>
       <w:pPr>
-        <w:pStyle w:val="Heading3"/>
+        <w:pStyle w:val="Heading2"/>
       </w:pPr>
       <w:r>
+        <w:rPr>
+          <w:rFonts w:ascii="Aptos" w:hAnsi="Aptos"/>
+          <w:b/>
+          <w:sz w:val="26"/>
+        </w:rPr>
         <w:t>Change forecast behavior</w:t>
       </w:r>
     </w:p>
     <w:p>
       <w:pPr>
-        <w:pStyle w:val="ListNumber"/>
-        <w:spacing w:after="60"/>
+        <w:pStyle w:val="ListBullet"/>
       </w:pPr>
       <w:r>
+        <w:rPr>
+          <w:rFonts w:ascii="Aptos" w:hAnsi="Aptos"/>
+          <w:sz w:val="22"/>
+        </w:rPr>
         <w:t>Edit lib/dashboard-forecast.ts.</w:t>
       </w:r>
     </w:p>
     <w:p>
       <w:pPr>
-        <w:pStyle w:val="ListNumber"/>
-        <w:spacing w:after="60"/>
+        <w:pStyle w:val="ListBullet"/>
       </w:pPr>
       <w:r>
+        <w:rPr>
+          <w:rFonts w:ascii="Aptos" w:hAnsi="Aptos"/>
+          <w:sz w:val="22"/>
+        </w:rPr>
         <w:t>Keep the model explainable and bounded.</w:t>
       </w:r>
     </w:p>
     <w:p>
       <w:pPr>
-        <w:pStyle w:val="ListNumber"/>
-        <w:spacing w:after="60"/>
+        <w:pStyle w:val="ListBullet"/>
       </w:pPr>
       <w:r>
+        <w:rPr>
+          <w:rFonts w:ascii="Aptos" w:hAnsi="Aptos"/>
+          <w:sz w:val="22"/>
+        </w:rPr>
         <w:t>Update user-facing wording if the interpretation changes.</w:t>
       </w:r>
     </w:p>
     <w:p>
       <w:pPr>
-        <w:pStyle w:val="ListNumber"/>
-        <w:spacing w:after="60"/>
+        <w:pStyle w:val="ListBullet"/>
       </w:pPr>
       <w:r>
+        <w:rPr>
+          <w:rFonts w:ascii="Aptos" w:hAnsi="Aptos"/>
+          <w:sz w:val="22"/>
+        </w:rPr>
         <w:t>Add or update tests in lib/dashboard-forecast.test.ts.</w:t>
       </w:r>
     </w:p>
     <w:p>
       <w:pPr>
-        <w:pStyle w:val="Heading3"/>
+        <w:pStyle w:val="Heading2"/>
       </w:pPr>
       <w:r>
+        <w:rPr>
+          <w:rFonts w:ascii="Aptos" w:hAnsi="Aptos"/>
+          <w:b/>
+          <w:sz w:val="26"/>
+        </w:rPr>
         <w:t>Change revision storage</w:t>
       </w:r>
     </w:p>
     <w:p>
       <w:pPr>
-        <w:pStyle w:val="ListNumber"/>
-        <w:spacing w:after="60"/>
+        <w:pStyle w:val="ListBullet"/>
       </w:pPr>
       <w:r>
+        <w:rPr>
+          <w:rFonts w:ascii="Aptos" w:hAnsi="Aptos"/>
+          <w:sz w:val="22"/>
+        </w:rPr>
         <w:t>Start in lib/dashboard-db.ts.</w:t>
       </w:r>
     </w:p>
     <w:p>
       <w:pPr>
-        <w:pStyle w:val="ListNumber"/>
-        <w:spacing w:after="60"/>
+        <w:pStyle w:val="ListBullet"/>
       </w:pPr>
       <w:r>
+        <w:rPr>
+          <w:rFonts w:ascii="Aptos" w:hAnsi="Aptos"/>
+          <w:sz w:val="22"/>
+        </w:rPr>
         <w:t>Preserve migration safety from data/weekly-metrics.json.</w:t>
       </w:r>
     </w:p>
     <w:p>
       <w:pPr>
-        <w:pStyle w:val="ListNumber"/>
-        <w:spacing w:after="60"/>
+        <w:pStyle w:val="ListBullet"/>
       </w:pPr>
       <w:r>
+        <w:rPr>
+          <w:rFonts w:ascii="Aptos" w:hAnsi="Aptos"/>
+          <w:sz w:val="22"/>
+        </w:rPr>
         <w:t>Keep listWeeklySnapshots() returning only latest revisions.</w:t>
       </w:r>
     </w:p>
     <w:p>
       <w:pPr>
-        <w:pStyle w:val="ListNumber"/>
-        <w:spacing w:after="60"/>
+        <w:pStyle w:val="ListBullet"/>
       </w:pPr>
       <w:r>
+        <w:rPr>
+          <w:rFonts w:ascii="Aptos" w:hAnsi="Aptos"/>
+          <w:sz w:val="22"/>
+        </w:rPr>
         <w:t>Keep the revisions route contract intact.</w:t>
       </w:r>
     </w:p>
     <w:p>
       <w:pPr>
-        <w:pStyle w:val="Heading2"/>
+        <w:pStyle w:val="Heading1"/>
       </w:pPr>
       <w:r>
-        <w:t>Known constraints</w:t>
+        <w:rPr>
+          <w:rFonts w:ascii="Aptos" w:hAnsi="Aptos"/>
+          <w:b/>
+          <w:sz w:val="32"/>
+        </w:rPr>
+        <w:t>Known Constraints</w:t>
       </w:r>
     </w:p>
     <w:p>
       <w:pPr>
         <w:pStyle w:val="ListBullet"/>
-        <w:spacing w:after="60"/>
       </w:pPr>
       <w:r>
-        <w:t>The dashboard is currently single-workspace in practice, even though the DB schema supports workspaces.</w:t>
+        <w:rPr>
+          <w:rFonts w:ascii="Aptos" w:hAnsi="Aptos"/>
+          <w:sz w:val="22"/>
+        </w:rPr>
+        <w:t>The dashboard is currently single-workspace in practice even though the DB schema supports workspaces.</w:t>
       </w:r>
     </w:p>
     <w:p>
       <w:pPr>
         <w:pStyle w:val="ListBullet"/>
-        <w:spacing w:after="60"/>
       </w:pPr>
       <w:r>
-        <w:t>The main dashboard component is still large. Prefer extracting helper cards or sections instead of adding more inline complexity.</w:t>
+        <w:rPr>
+          <w:rFonts w:ascii="Aptos" w:hAnsi="Aptos"/>
+          <w:sz w:val="22"/>
+        </w:rPr>
+        <w:t>The user store is local JSON, not a production identity provider.</w:t>
       </w:r>
     </w:p>
     <w:p>
       <w:pPr>
         <w:pStyle w:val="ListBullet"/>
-        <w:spacing w:after="60"/>
       </w:pPr>
       <w:r>
+        <w:rPr>
+          <w:rFonts w:ascii="Aptos" w:hAnsi="Aptos"/>
+          <w:sz w:val="22"/>
+        </w:rPr>
+        <w:t>The main dashboard component is still large, so prefer extracting helper cards or sections instead of adding more inline complexity.</w:t>
+      </w:r>
+    </w:p>
+    <w:p>
+      <w:pPr>
+        <w:pStyle w:val="ListBullet"/>
+      </w:pPr>
+      <w:r>
+        <w:rPr>
+          <w:rFonts w:ascii="Aptos" w:hAnsi="Aptos"/>
+          <w:sz w:val="22"/>
+        </w:rPr>
         <w:t>Some legacy helper files may exist before a UI is fully wired. Confirm usage before removing them.</w:t>
       </w:r>
     </w:p>
     <w:sectPr>
-      <w:footerReference w:type="default" r:id="rId9"/>
       <w:pgSz w:w="12240" w:h="15840"/>
-      <w:pgMar w:top="1152" w:right="1224" w:bottom="1008" w:left="1224" w:header="720" w:footer="720" w:gutter="0"/>
+      <w:pgMar w:top="1080" w:right="1280" w:bottom="1080" w:left="1280" w:header="720" w:footer="720" w:gutter="0"/>
       <w:cols w:space="720"/>
       <w:docGrid w:linePitch="360"/>
     </w:sectPr>
   </w:body>
 </w:document>
-</file>
-
-<file path=word/footer1.xml><?xml version="1.0" encoding="utf-8"?>
-<w:ftr xmlns:m="http://schemas.openxmlformats.org/officeDocument/2006/math" xmlns:mc="http://schemas.openxmlformats.org/markup-compatibility/2006" xmlns:mo="http://schemas.microsoft.com/office/mac/office/2008/main" xmlns:mv="urn:schemas-microsoft-com:mac:vml" xmlns:o="urn:schemas-microsoft-com:office:office" xmlns:r="http://schemas.openxmlformats.org/officeDocument/2006/relationships" xmlns:v="urn:schemas-microsoft-com:vml" xmlns:w10="urn:schemas-microsoft-com:office:word" xmlns:w14="http://schemas.microsoft.com/office/word/2010/wordml" xmlns:w="http://schemas.openxmlformats.org/wordprocessingml/2006/main" xmlns:wne="http://schemas.microsoft.com/office/word/2006/wordml" xmlns:wp14="http://schemas.microsoft.com/office/word/2010/wordprocessingDrawing" xmlns:wp="http://schemas.openxmlformats.org/drawingml/2006/wordprocessingDrawing" xmlns:wpc="http://schemas.microsoft.com/office/word/2010/wordprocessingCanvas" xmlns:wpg="http://schemas.microsoft.com/office/word/2010/wordprocessingGroup" xmlns:wpi="http://schemas.microsoft.com/office/word/2010/wordprocessingInk" xmlns:wps="http://schemas.microsoft.com/office/word/2010/wordprocessingShape" mc:Ignorable="w14 wp14">
-  <w:p>
-    <w:pPr>
-      <w:pStyle w:val="Footer"/>
-      <w:jc w:val="right"/>
-    </w:pPr>
-    <w:r>
-      <w:t xml:space="preserve">Page </w:t>
-    </w:r>
-    <w:r>
-      <w:fldChar w:fldCharType="begin"/>
-      <w:instrText xml:space="preserve">PAGE</w:instrText>
-      <w:fldChar w:fldCharType="end"/>
-    </w:r>
-  </w:p>
-</w:ftr>
 </file>
 
 <file path=word/numbering.xml><?xml version="1.0" encoding="utf-8"?>
@@ -1420,11 +1861,11 @@
       <w:outlineLvl w:val="0"/>
     </w:pPr>
     <w:rPr>
-      <w:rFonts w:asciiTheme="majorHAnsi" w:eastAsiaTheme="majorEastAsia" w:hAnsiTheme="majorHAnsi" w:cstheme="majorBidi" w:ascii="Aptos Display" w:hAnsi="Aptos Display"/>
+      <w:rFonts w:asciiTheme="majorHAnsi" w:eastAsiaTheme="majorEastAsia" w:hAnsiTheme="majorHAnsi" w:cstheme="majorBidi" w:ascii="Aptos" w:hAnsi="Aptos"/>
       <w:b/>
       <w:bCs/>
-      <w:color w:val="1F4E79"/>
-      <w:sz w:val="36"/>
+      <w:color w:val="365F91" w:themeColor="accent1" w:themeShade="BF"/>
+      <w:sz w:val="32"/>
       <w:szCs w:val="28"/>
     </w:rPr>
   </w:style>
@@ -1444,11 +1885,11 @@
       <w:outlineLvl w:val="1"/>
     </w:pPr>
     <w:rPr>
-      <w:rFonts w:asciiTheme="majorHAnsi" w:eastAsiaTheme="majorEastAsia" w:hAnsiTheme="majorHAnsi" w:cstheme="majorBidi" w:ascii="Aptos Display" w:hAnsi="Aptos Display"/>
+      <w:rFonts w:asciiTheme="majorHAnsi" w:eastAsiaTheme="majorEastAsia" w:hAnsiTheme="majorHAnsi" w:cstheme="majorBidi" w:ascii="Aptos" w:hAnsi="Aptos"/>
       <w:b/>
       <w:bCs/>
-      <w:color w:val="1F4E79"/>
-      <w:sz w:val="28"/>
+      <w:color w:val="4F81BD" w:themeColor="accent1"/>
+      <w:sz w:val="26"/>
       <w:szCs w:val="26"/>
     </w:rPr>
   </w:style>
@@ -1471,8 +1912,8 @@
       <w:rFonts w:asciiTheme="majorHAnsi" w:eastAsiaTheme="majorEastAsia" w:hAnsiTheme="majorHAnsi" w:cstheme="majorBidi" w:ascii="Aptos" w:hAnsi="Aptos"/>
       <w:b/>
       <w:bCs/>
-      <w:color w:val="1F4E79"/>
-      <w:sz w:val="24"/>
+      <w:color w:val="4F81BD" w:themeColor="accent1"/>
+      <w:sz w:val="22"/>
     </w:rPr>
   </w:style>
   <w:style w:type="paragraph" w:styleId="Heading4">
@@ -1710,12 +2151,12 @@
       <w:contextualSpacing/>
     </w:pPr>
     <w:rPr>
-      <w:rFonts w:asciiTheme="majorHAnsi" w:eastAsiaTheme="majorEastAsia" w:hAnsiTheme="majorHAnsi" w:cstheme="majorBidi" w:ascii="Aptos Display" w:hAnsi="Aptos Display"/>
+      <w:rFonts w:asciiTheme="majorHAnsi" w:eastAsiaTheme="majorEastAsia" w:hAnsiTheme="majorHAnsi" w:cstheme="majorBidi" w:ascii="Aptos" w:hAnsi="Aptos"/>
       <w:b/>
-      <w:color w:val="1F4E79"/>
+      <w:color w:val="17365D" w:themeColor="text2" w:themeShade="BF"/>
       <w:spacing w:val="5"/>
       <w:kern w:val="28"/>
-      <w:sz w:val="48"/>
+      <w:sz w:val="44"/>
       <w:szCs w:val="52"/>
     </w:rPr>
   </w:style>
@@ -1748,12 +2189,13 @@
       </w:numPr>
     </w:pPr>
     <w:rPr>
-      <w:rFonts w:asciiTheme="majorHAnsi" w:eastAsiaTheme="majorEastAsia" w:hAnsiTheme="majorHAnsi" w:cstheme="majorBidi"/>
+      <w:rFonts w:asciiTheme="majorHAnsi" w:eastAsiaTheme="majorEastAsia" w:hAnsiTheme="majorHAnsi" w:cstheme="majorBidi" w:ascii="Aptos" w:hAnsi="Aptos"/>
+      <w:b w:val="0"/>
       <w:i/>
       <w:iCs/>
       <w:color w:val="4F81BD" w:themeColor="accent1"/>
       <w:spacing w:val="15"/>
-      <w:sz w:val="24"/>
+      <w:sz w:val="22"/>
       <w:szCs w:val="24"/>
     </w:rPr>
   </w:style>

</xml_diff>